<commit_message>
Manual field editing, upright pages from upload, remove profile panel
- Lab worker can edit / add / delete any field value at any time, whether or
  not the form was extracted (POST/DELETE /forms/{id}/fields); manual values
  are confirmed, survive re-extraction, and don't take a queued form out of
  the queue. Pencil icon on every table row opens the form in edit mode.
- Pages are made upright (OSD 90/180/270) and deskewed at upload, so the page
  shown is always straight even before extraction; pages straightened in
  parallel; skew measured at half resolution.
- Removed the lab-worker profile panel and header user menu (and Toggle),
  plus their mentions in the docs.
- Folder rename fronend -> frontend.
</commit_message>
<xml_diff>
--- a/Design System/UI_Design_System_and_Screens.docx
+++ b/Design System/UI_Design_System_and_Screens.docx
@@ -412,86 +412,6 @@
     </w:p>
     <w:p>
       <w:pPr>
-        <w:pStyle w:val="Heading2"/>
-        <w:spacing w:after="150" w:before="300"/>
-      </w:pPr>
-      <w:r>
-        <w:t xml:space="preserve">2.3 חלונית פרופיל משתמש (Profile Panel)</w:t>
-      </w:r>
-    </w:p>
-    <w:p>
-      <w:pPr>
-        <w:bidi/>
-        <w:spacing w:after="120"/>
-      </w:pPr>
-      <w:r>
-        <w:rPr>
-          <w:rFonts w:ascii="Arial" w:cs="Arial" w:eastAsia="Arial" w:hAnsi="Arial"/>
-          <w:sz w:val="22"/>
-          <w:szCs w:val="22"/>
-        </w:rPr>
-        <w:t xml:space="preserve">נפתחת מהצד הימני בלחיצה על אזור המשתמש בהדר.</w:t>
-      </w:r>
-    </w:p>
-    <w:p>
-      <w:pPr>
-        <w:pStyle w:val="ListParagraph"/>
-        <w:numPr>
-          <w:ilvl w:val="0"/>
-          <w:numId w:val="1"/>
-        </w:numPr>
-        <w:bidi/>
-        <w:spacing w:after="80"/>
-      </w:pPr>
-      <w:r>
-        <w:rPr>
-          <w:rFonts w:ascii="Arial" w:cs="Arial" w:eastAsia="Arial" w:hAnsi="Arial"/>
-          <w:sz w:val="22"/>
-          <w:szCs w:val="22"/>
-        </w:rPr>
-        <w:t xml:space="preserve">טאב "פרטים אישיים" – 6 שדות הניתנים לעריכה inline</w:t>
-      </w:r>
-    </w:p>
-    <w:p>
-      <w:pPr>
-        <w:pStyle w:val="ListParagraph"/>
-        <w:numPr>
-          <w:ilvl w:val="0"/>
-          <w:numId w:val="1"/>
-        </w:numPr>
-        <w:bidi/>
-        <w:spacing w:after="80"/>
-      </w:pPr>
-      <w:r>
-        <w:rPr>
-          <w:rFonts w:ascii="Arial" w:cs="Arial" w:eastAsia="Arial" w:hAnsi="Arial"/>
-          <w:sz w:val="22"/>
-          <w:szCs w:val="22"/>
-        </w:rPr>
-        <w:t xml:space="preserve">טאב "היסטוריה" – לוג פעולות אחרונות עם סטטוס</w:t>
-      </w:r>
-    </w:p>
-    <w:p>
-      <w:pPr>
-        <w:pStyle w:val="ListParagraph"/>
-        <w:numPr>
-          <w:ilvl w:val="0"/>
-          <w:numId w:val="1"/>
-        </w:numPr>
-        <w:bidi/>
-        <w:spacing w:after="80"/>
-      </w:pPr>
-      <w:r>
-        <w:rPr>
-          <w:rFonts w:ascii="Arial" w:cs="Arial" w:eastAsia="Arial" w:hAnsi="Arial"/>
-          <w:sz w:val="22"/>
-          <w:szCs w:val="22"/>
-        </w:rPr>
-        <w:t xml:space="preserve">טאב "הגדרות" – Dark mode, התראות, שפה, התנתקות</w:t>
-      </w:r>
-    </w:p>
-    <w:p>
-      <w:pPr>
         <w:pBdr>
           <w:bottom w:val="single" w:color="CCCCCC" w:sz="1"/>
         </w:pBdr>
@@ -883,72 +803,6 @@
           <w:szCs w:val="22"/>
         </w:rPr>
         <w:t xml:space="preserve">שמירה: מעדכנת status ל-confirmed, מחשבת מחדש status הטופס</w:t>
-      </w:r>
-    </w:p>
-    <w:p>
-      <w:pPr>
-        <w:pStyle w:val="Heading2"/>
-        <w:spacing w:after="150" w:before="300"/>
-      </w:pPr>
-      <w:r>
-        <w:t xml:space="preserve">3.5 ProfilePage – src/components/ProfilePage.jsx</w:t>
-      </w:r>
-    </w:p>
-    <w:p>
-      <w:pPr>
-        <w:pStyle w:val="ListParagraph"/>
-        <w:numPr>
-          <w:ilvl w:val="0"/>
-          <w:numId w:val="1"/>
-        </w:numPr>
-        <w:bidi/>
-        <w:spacing w:after="80"/>
-      </w:pPr>
-      <w:r>
-        <w:rPr>
-          <w:rFonts w:ascii="Arial" w:cs="Arial" w:eastAsia="Arial" w:hAnsi="Arial"/>
-          <w:sz w:val="22"/>
-          <w:szCs w:val="22"/>
-        </w:rPr>
-        <w:t xml:space="preserve">עריכת שדה: Pencil icon (sky-500 hover) → input + Check/X</w:t>
-      </w:r>
-    </w:p>
-    <w:p>
-      <w:pPr>
-        <w:pStyle w:val="ListParagraph"/>
-        <w:numPr>
-          <w:ilvl w:val="0"/>
-          <w:numId w:val="1"/>
-        </w:numPr>
-        <w:bidi/>
-        <w:spacing w:after="80"/>
-      </w:pPr>
-      <w:r>
-        <w:rPr>
-          <w:rFonts w:ascii="Arial" w:cs="Arial" w:eastAsia="Arial" w:hAnsi="Arial"/>
-          <w:sz w:val="22"/>
-          <w:szCs w:val="22"/>
-        </w:rPr>
-        <w:t xml:space="preserve">Enter: שמירה | Escape: ביטול | שמירה מעדכנת כותרת בזמן אמת</w:t>
-      </w:r>
-    </w:p>
-    <w:p>
-      <w:pPr>
-        <w:pStyle w:val="ListParagraph"/>
-        <w:numPr>
-          <w:ilvl w:val="0"/>
-          <w:numId w:val="1"/>
-        </w:numPr>
-        <w:bidi/>
-        <w:spacing w:after="80"/>
-      </w:pPr>
-      <w:r>
-        <w:rPr>
-          <w:rFonts w:ascii="Arial" w:cs="Arial" w:eastAsia="Arial" w:hAnsi="Arial"/>
-          <w:sz w:val="22"/>
-          <w:szCs w:val="22"/>
-        </w:rPr>
-        <w:t xml:space="preserve">Toggles: w-12 h-6 rounded-full, teal כשפעיל</w:t>
       </w:r>
     </w:p>
     <w:p>
@@ -1224,7 +1078,7 @@
                 <w:sz w:val="20"/>
                 <w:szCs w:val="20"/>
               </w:rPr>
-              <w:t xml:space="preserve">Header פרופיל, טקסט ראשי</w:t>
+              <w:t xml:space="preserve">טקסט ראשי</w:t>
             </w:r>
           </w:p>
         </w:tc>
@@ -2506,7 +2360,7 @@
           <w:sz w:val="22"/>
           <w:szCs w:val="22"/>
         </w:rPr>
-        <w:t xml:space="preserve">הפעלה: כפתור בהדר או toggle בפרופיל → הגדרות</w:t>
+        <w:t xml:space="preserve">הפעלה: כפתור בהדר</w:t>
       </w:r>
     </w:p>
     <w:p>
@@ -2651,7 +2505,7 @@
           <w:sz w:val="18"/>
           <w:szCs w:val="18"/>
         </w:rPr>
-        <w:t xml:space="preserve">├── src/components/ Header | StatsCards | DataTable | ValidationModal | ProfilePage | Footer</w:t>
+        <w:t xml:space="preserve">├── src/components/ Header | StatsCards | DataTable | ValidationModal | Footer</w:t>
       </w:r>
     </w:p>
     <w:p>

</xml_diff>